<commit_message>
Haciendo EJ3 y 4, TP5
</commit_message>
<xml_diff>
--- a/TP5/2026_RI_TP5_web.docx
+++ b/TP5/2026_RI_TP5_web.docx
@@ -540,7 +540,35 @@
           <w:sz w:val="24"/>
           <w:szCs w:val="24"/>
         </w:rPr>
-        <w:t>Utilizando las librería BeautifullSoup y requests, se construyo un script en Python que, dado una URL, descarga la página, extraiga los enlaces y los muestra por consola.</w:t>
+        <w:t xml:space="preserve">Utilizando las librería BeautifullSoup y requests, se </w:t>
+      </w:r>
+      <w:r>
+        <w:rPr>
+          <w:sz w:val="24"/>
+          <w:szCs w:val="24"/>
+        </w:rPr>
+        <w:t>construyó</w:t>
+      </w:r>
+      <w:r>
+        <w:rPr>
+          <w:sz w:val="24"/>
+          <w:szCs w:val="24"/>
+        </w:rPr>
+        <w:t xml:space="preserve"> un script en Python que, dado una URL, descarga la página, extra</w:t>
+      </w:r>
+      <w:r>
+        <w:rPr>
+          <w:sz w:val="24"/>
+          <w:szCs w:val="24"/>
+        </w:rPr>
+        <w:t>e</w:t>
+      </w:r>
+      <w:r>
+        <w:rPr>
+          <w:sz w:val="24"/>
+          <w:szCs w:val="24"/>
+        </w:rPr>
+        <w:t xml:space="preserve"> los enlaces y los muestra por consola.</w:t>
       </w:r>
     </w:p>
     <w:p>
@@ -583,6 +611,7 @@
       </w:pPr>
       <w:r>
         <w:rPr>
+          <w:noProof/>
           <w:sz w:val="24"/>
           <w:szCs w:val="24"/>
         </w:rPr>
@@ -650,26 +679,41 @@
           <w:sz w:val="24"/>
           <w:szCs w:val="24"/>
         </w:rPr>
-        <w:t>Para probar el script, se utilizó la página de Wikipedia de “Argentina”, obteniendo un total de 7107 enlaces.</w:t>
-      </w:r>
-    </w:p>
-    <w:p>
-      <w:pPr>
-        <w:rPr>
-          <w:sz w:val="24"/>
-          <w:szCs w:val="24"/>
-        </w:rPr>
-      </w:pPr>
-    </w:p>
-    <w:p>
-      <w:pPr>
-        <w:rPr>
-          <w:sz w:val="24"/>
-          <w:szCs w:val="24"/>
-        </w:rPr>
-      </w:pPr>
-      <w:r>
-        <w:rPr>
+        <w:t>Para probar</w:t>
+      </w:r>
+      <w:r>
+        <w:rPr>
+          <w:sz w:val="24"/>
+          <w:szCs w:val="24"/>
+        </w:rPr>
+        <w:t>lo</w:t>
+      </w:r>
+      <w:r>
+        <w:rPr>
+          <w:sz w:val="24"/>
+          <w:szCs w:val="24"/>
+        </w:rPr>
+        <w:t>, se utilizó la página de Wikipedia de “Argentina”, obteniendo un total de 7107 enlaces.</w:t>
+      </w:r>
+    </w:p>
+    <w:p>
+      <w:pPr>
+        <w:rPr>
+          <w:sz w:val="24"/>
+          <w:szCs w:val="24"/>
+        </w:rPr>
+      </w:pPr>
+    </w:p>
+    <w:p>
+      <w:pPr>
+        <w:rPr>
+          <w:sz w:val="24"/>
+          <w:szCs w:val="24"/>
+        </w:rPr>
+      </w:pPr>
+      <w:r>
+        <w:rPr>
+          <w:noProof/>
           <w:sz w:val="24"/>
           <w:szCs w:val="24"/>
         </w:rPr>
@@ -723,6 +767,65 @@
       </w:pPr>
     </w:p>
     <w:p>
+      <w:r>
+        <w:t xml:space="preserve">En este caso, todos los enlaces no están normalizados, es por ello que fue necesario implementar un parser, </w:t>
+      </w:r>
+      <w:r>
+        <w:t>buscando</w:t>
+      </w:r>
+      <w:r>
+        <w:t xml:space="preserve"> normalizar rutas relativas y absolutas. Aplicado esto, el resultado es:</w:t>
+      </w:r>
+    </w:p>
+    <w:p/>
+    <w:p>
+      <w:r>
+        <w:drawing>
+          <wp:inline distT="0" distB="0" distL="0" distR="0" wp14:anchorId="6AFB2929" wp14:editId="44B7A137">
+            <wp:extent cx="6121199" cy="1280160"/>
+            <wp:effectExtent l="0" t="0" r="0" b="0"/>
+            <wp:docPr id="4" name="Imagen 4"/>
+            <wp:cNvGraphicFramePr>
+              <a:graphicFrameLocks xmlns:a="http://schemas.openxmlformats.org/drawingml/2006/main" noChangeAspect="1"/>
+            </wp:cNvGraphicFramePr>
+            <a:graphic xmlns:a="http://schemas.openxmlformats.org/drawingml/2006/main">
+              <a:graphicData uri="http://schemas.openxmlformats.org/drawingml/2006/picture">
+                <pic:pic xmlns:pic="http://schemas.openxmlformats.org/drawingml/2006/picture">
+                  <pic:nvPicPr>
+                    <pic:cNvPr id="1" name=""/>
+                    <pic:cNvPicPr/>
+                  </pic:nvPicPr>
+                  <pic:blipFill rotWithShape="1">
+                    <a:blip r:embed="rId13"/>
+                    <a:srcRect t="29439" b="16698"/>
+                    <a:stretch/>
+                  </pic:blipFill>
+                  <pic:spPr bwMode="auto">
+                    <a:xfrm>
+                      <a:off x="0" y="0"/>
+                      <a:ext cx="6121400" cy="1280202"/>
+                    </a:xfrm>
+                    <a:prstGeom prst="rect">
+                      <a:avLst/>
+                    </a:prstGeom>
+                    <a:ln>
+                      <a:noFill/>
+                    </a:ln>
+                    <a:extLst>
+                      <a:ext uri="{53640926-AAD7-44D8-BBD7-CCE9431645EC}">
+                        <a14:shadowObscured xmlns:a14="http://schemas.microsoft.com/office/drawing/2010/main"/>
+                      </a:ext>
+                    </a:extLst>
+                  </pic:spPr>
+                </pic:pic>
+              </a:graphicData>
+            </a:graphic>
+          </wp:inline>
+        </w:drawing>
+      </w:r>
+    </w:p>
+    <w:p/>
+    <w:p>
       <w:pPr>
         <w:rPr>
           <w:b/>
@@ -821,7 +924,7 @@
                     <pic:cNvPicPr/>
                   </pic:nvPicPr>
                   <pic:blipFill>
-                    <a:blip r:embed="rId13"/>
+                    <a:blip r:embed="rId14"/>
                     <a:stretch>
                       <a:fillRect/>
                     </a:stretch>
@@ -2106,7 +2209,7 @@
                     <pic:cNvPicPr/>
                   </pic:nvPicPr>
                   <pic:blipFill>
-                    <a:blip r:embed="rId14"/>
+                    <a:blip r:embed="rId15"/>
                     <a:stretch>
                       <a:fillRect/>
                     </a:stretch>
@@ -2405,7 +2508,7 @@
       </w:r>
     </w:p>
     <w:sectPr>
-      <w:headerReference w:type="default" r:id="rId15"/>
+      <w:headerReference w:type="default" r:id="rId16"/>
       <w:pgSz w:w="11906" w:h="16838"/>
       <w:pgMar w:top="1133" w:right="1133" w:bottom="1133" w:left="1133" w:header="850" w:footer="850" w:gutter="0"/>
       <w:pgNumType w:start="1"/>

</xml_diff>